<commit_message>
cambio en la plantilla
</commit_message>
<xml_diff>
--- a/public/template/temp.docx
+++ b/public/template/temp.docx
@@ -76,27 +76,7 @@
           <w:szCs w:val="20"/>
           <w:lang w:val="es-ES"/>
         </w:rPr>
-        <w:t>${fecha</w:t>
-      </w:r>
-      <w:r>
-        <w:rPr>
-          <w:rFonts w:ascii="Nunito" w:eastAsia="Nunito" w:hAnsi="Nunito" w:cs="Nunito"/>
-          <w:bCs/>
-          <w:sz w:val="20"/>
-          <w:szCs w:val="20"/>
-          <w:lang w:val="es-ES"/>
-        </w:rPr>
-        <w:t>_generacion</w:t>
-      </w:r>
-      <w:r>
-        <w:rPr>
-          <w:rFonts w:ascii="Nunito" w:eastAsia="Nunito" w:hAnsi="Nunito" w:cs="Nunito"/>
-          <w:bCs/>
-          <w:sz w:val="20"/>
-          <w:szCs w:val="20"/>
-          <w:lang w:val="es-ES"/>
-        </w:rPr>
-        <w:t>}</w:t>
+        <w:t>${fecha_generacion}</w:t>
       </w:r>
     </w:p>
     <w:p>
@@ -240,40 +220,7 @@
     </w:p>
     <w:p>
       <w:pPr>
-        <w:ind w:left="-567"/>
-        <w:jc w:val="both"/>
-        <w:rPr>
-          <w:rFonts w:ascii="Poppins" w:eastAsia="Nunito" w:hAnsi="Poppins" w:cs="Poppins"/>
-          <w:sz w:val="24"/>
-          <w:szCs w:val="24"/>
-        </w:rPr>
-      </w:pPr>
-    </w:p>
-    <w:p>
-      <w:pPr>
-        <w:ind w:left="-567"/>
-        <w:jc w:val="both"/>
-        <w:rPr>
-          <w:rFonts w:ascii="Poppins" w:eastAsia="Nunito" w:hAnsi="Poppins" w:cs="Poppins"/>
-          <w:sz w:val="24"/>
-          <w:szCs w:val="24"/>
-        </w:rPr>
-      </w:pPr>
-    </w:p>
-    <w:p>
-      <w:pPr>
-        <w:ind w:left="-567"/>
-        <w:jc w:val="both"/>
-        <w:rPr>
-          <w:rFonts w:ascii="Poppins" w:eastAsia="Nunito" w:hAnsi="Poppins" w:cs="Poppins"/>
-          <w:sz w:val="24"/>
-          <w:szCs w:val="24"/>
-        </w:rPr>
-      </w:pPr>
-    </w:p>
-    <w:p>
-      <w:pPr>
-        <w:ind w:left="-567"/>
+        <w:ind w:left="0"/>
         <w:jc w:val="both"/>
         <w:rPr>
           <w:rFonts w:ascii="Poppins" w:eastAsia="Nunito" w:hAnsi="Poppins" w:cs="Poppins"/>
@@ -510,27 +457,7 @@
                 <w:szCs w:val="20"/>
                 <w:lang w:val="es-ES"/>
               </w:rPr>
-              <w:t>${</w:t>
-            </w:r>
-            <w:proofErr w:type="spellStart"/>
-            <w:r>
-              <w:rPr>
-                <w:rFonts w:ascii="Nunito" w:eastAsia="Nunito" w:hAnsi="Nunito" w:cs="Nunito"/>
-                <w:sz w:val="20"/>
-                <w:szCs w:val="20"/>
-                <w:lang w:val="es-ES"/>
-              </w:rPr>
-              <w:t>direccion</w:t>
-            </w:r>
-            <w:proofErr w:type="spellEnd"/>
-            <w:r>
-              <w:rPr>
-                <w:rFonts w:ascii="Nunito" w:eastAsia="Nunito" w:hAnsi="Nunito" w:cs="Nunito"/>
-                <w:sz w:val="20"/>
-                <w:szCs w:val="20"/>
-                <w:lang w:val="es-ES"/>
-              </w:rPr>
-              <w:t>}</w:t>
+              <w:t>${direccion}</w:t>
             </w:r>
           </w:p>
         </w:tc>
@@ -658,25 +585,7 @@
                 <w:sz w:val="20"/>
                 <w:szCs w:val="20"/>
               </w:rPr>
-              <w:t>${</w:t>
-            </w:r>
-            <w:proofErr w:type="spellStart"/>
-            <w:r>
-              <w:rPr>
-                <w:rFonts w:ascii="Nunito" w:eastAsia="Nunito" w:hAnsi="Nunito" w:cs="Nunito"/>
-                <w:sz w:val="20"/>
-                <w:szCs w:val="20"/>
-              </w:rPr>
-              <w:t>medidor_anomalia</w:t>
-            </w:r>
-            <w:proofErr w:type="spellEnd"/>
-            <w:r>
-              <w:rPr>
-                <w:rFonts w:ascii="Nunito" w:eastAsia="Nunito" w:hAnsi="Nunito" w:cs="Nunito"/>
-                <w:sz w:val="20"/>
-                <w:szCs w:val="20"/>
-              </w:rPr>
-              <w:t>}</w:t>
+              <w:t>${medidor_anomalia}</w:t>
             </w:r>
           </w:p>
         </w:tc>
@@ -878,7 +787,6 @@
               </w:rPr>
               <w:t>${</w:t>
             </w:r>
-            <w:proofErr w:type="spellStart"/>
             <w:r>
               <w:rPr>
                 <w:rFonts w:ascii="Nunito" w:eastAsia="Nunito" w:hAnsi="Nunito" w:cs="Nunito"/>
@@ -888,7 +796,6 @@
               </w:rPr>
               <w:t>marca_regulador</w:t>
             </w:r>
-            <w:proofErr w:type="spellEnd"/>
             <w:r>
               <w:rPr>
                 <w:rFonts w:ascii="Nunito" w:eastAsia="Nunito" w:hAnsi="Nunito" w:cs="Nunito"/>
@@ -1028,7 +935,6 @@
               </w:rPr>
               <w:t>${</w:t>
             </w:r>
-            <w:proofErr w:type="spellStart"/>
             <w:r>
               <w:rPr>
                 <w:rFonts w:ascii="Nunito" w:eastAsia="Nunito" w:hAnsi="Nunito" w:cs="Nunito"/>
@@ -1038,7 +944,6 @@
               </w:rPr>
               <w:t>tipo_regulador</w:t>
             </w:r>
-            <w:proofErr w:type="spellEnd"/>
             <w:r>
               <w:rPr>
                 <w:rFonts w:ascii="Nunito" w:eastAsia="Nunito" w:hAnsi="Nunito" w:cs="Nunito"/>
@@ -1107,7 +1012,6 @@
               </w:rPr>
               <w:t>${</w:t>
             </w:r>
-            <w:proofErr w:type="spellStart"/>
             <w:r>
               <w:rPr>
                 <w:rFonts w:ascii="Nunito" w:eastAsia="Nunito" w:hAnsi="Nunito" w:cs="Nunito"/>
@@ -1117,7 +1021,6 @@
               </w:rPr>
               <w:t>marca_medidor</w:t>
             </w:r>
-            <w:proofErr w:type="spellEnd"/>
             <w:r>
               <w:rPr>
                 <w:rFonts w:ascii="Nunito" w:eastAsia="Nunito" w:hAnsi="Nunito" w:cs="Nunito"/>
@@ -1200,7 +1103,6 @@
               </w:rPr>
               <w:t>${</w:t>
             </w:r>
-            <w:proofErr w:type="spellStart"/>
             <w:r>
               <w:rPr>
                 <w:rFonts w:ascii="Nunito" w:eastAsia="Nunito" w:hAnsi="Nunito" w:cs="Nunito"/>
@@ -1210,7 +1112,6 @@
               </w:rPr>
               <w:t>nombre_comercio</w:t>
             </w:r>
-            <w:proofErr w:type="spellEnd"/>
             <w:r>
               <w:rPr>
                 <w:rFonts w:ascii="Nunito" w:eastAsia="Nunito" w:hAnsi="Nunito" w:cs="Nunito"/>
@@ -1291,27 +1192,7 @@
                 <w:szCs w:val="20"/>
                 <w:lang w:val="es-ES"/>
               </w:rPr>
-              <w:t>${</w:t>
-            </w:r>
-            <w:proofErr w:type="spellStart"/>
-            <w:r>
-              <w:rPr>
-                <w:rFonts w:ascii="Nunito" w:eastAsia="Nunito" w:hAnsi="Nunito" w:cs="Nunito"/>
-                <w:sz w:val="20"/>
-                <w:szCs w:val="20"/>
-                <w:lang w:val="es-ES"/>
-              </w:rPr>
-              <w:t>anomalia</w:t>
-            </w:r>
-            <w:proofErr w:type="spellEnd"/>
-            <w:r>
-              <w:rPr>
-                <w:rFonts w:ascii="Nunito" w:eastAsia="Nunito" w:hAnsi="Nunito" w:cs="Nunito"/>
-                <w:sz w:val="20"/>
-                <w:szCs w:val="20"/>
-                <w:lang w:val="es-ES"/>
-              </w:rPr>
-              <w:t>}</w:t>
+              <w:t>${anomalia}</w:t>
             </w:r>
           </w:p>
         </w:tc>
@@ -1519,6 +1400,7 @@
           <w:sz w:val="24"/>
           <w:szCs w:val="24"/>
         </w:rPr>
+        <w:lastRenderedPageBreak/>
         <w:t xml:space="preserve">Esta sección compila el material fotográfico recolectado durante la inspección. Cada imagen ha sido categorizada para brindar una evidencia visual clara y contextualizada de los puntos clave del Contrato </w:t>
       </w:r>
       <w:r>
@@ -2089,23 +1971,7 @@
                 <w:sz w:val="20"/>
                 <w:szCs w:val="20"/>
               </w:rPr>
-              <w:t>${foto</w:t>
-            </w:r>
-            <w:r>
-              <w:rPr>
-                <w:rFonts w:ascii="Nunito" w:eastAsia="Nunito" w:hAnsi="Nunito" w:cs="Nunito"/>
-                <w:sz w:val="20"/>
-                <w:szCs w:val="20"/>
-              </w:rPr>
-              <w:t>6</w:t>
-            </w:r>
-            <w:r>
-              <w:rPr>
-                <w:rFonts w:ascii="Nunito" w:eastAsia="Nunito" w:hAnsi="Nunito" w:cs="Nunito"/>
-                <w:sz w:val="20"/>
-                <w:szCs w:val="20"/>
-              </w:rPr>
-              <w:t>}</w:t>
+              <w:t>${foto6}</w:t>
             </w:r>
           </w:p>
         </w:tc>
@@ -2496,15 +2362,7 @@
                               <w:sz w:val="32"/>
                               <w:szCs w:val="32"/>
                             </w:rPr>
-                            <w:t>Reporté</w:t>
-                          </w:r>
-                          <w:r>
-                            <w:rPr>
-                              <w:rFonts w:ascii="Poppins" w:hAnsi="Poppins" w:cs="Poppins"/>
-                              <w:sz w:val="32"/>
-                              <w:szCs w:val="32"/>
-                            </w:rPr>
-                            <w:t xml:space="preserve"> de Medición y </w:t>
+                            <w:t xml:space="preserve">Reporté de Medición y </w:t>
                           </w:r>
                         </w:p>
                         <w:p>
@@ -3261,6 +3119,7 @@
   <w:style w:type="character" w:default="1" w:styleId="Fuentedeprrafopredeter">
     <w:name w:val="Default Paragraph Font"/>
     <w:uiPriority w:val="1"/>
+    <w:semiHidden/>
     <w:unhideWhenUsed/>
   </w:style>
   <w:style w:type="table" w:default="1" w:styleId="Tablanormal">

</xml_diff>